<commit_message>
docs: format GPS Solutions draft and verify all 21 rendered pages
</commit_message>
<xml_diff>
--- a/docs/paper_rebuild/TIM_EVIDENCE_20261005/manuscript/manuscript_gps_solutions_r3.docx
+++ b/docs/paper_rebuild/TIM_EVIDENCE_20261005/manuscript/manuscript_gps_solutions_r3.docx
@@ -2406,6 +2406,14 @@
     </w:p>
     <w:p>
       <w:pPr>
+        <w:widowControl/>
+      </w:pPr>
+      <w:r>
+        <w:t>Uncertainty evaluation requires identified input distributions and their correlations (JCGM 2008, 2011).</w:t>
+      </w:r>
+    </w:p>
+    <w:p>
+      <w:pPr>
         <w:pStyle w:val="Heading1"/>
       </w:pPr>
       <w:r>
@@ -3071,7 +3079,7 @@
     <w:qFormat/>
     <w:rsid w:val="00FC693F"/>
     <w:pPr>
-      <w:spacing w:after="100" w:line="259" w:lineRule="auto"/>
+      <w:spacing w:after="100" w:line="480" w:lineRule="auto"/>
     </w:pPr>
     <w:rPr>
       <w:rFonts w:ascii="Times New Roman" w:hAnsi="Times New Roman"/>
@@ -3134,7 +3142,7 @@
     <w:pPr>
       <w:keepNext/>
       <w:keepLines/>
-      <w:spacing w:before="200" w:after="100" w:line="259" w:lineRule="auto"/>
+      <w:spacing w:before="200" w:after="100" w:line="480" w:lineRule="auto"/>
       <w:outlineLvl w:val="0"/>
     </w:pPr>
     <w:rPr>
@@ -3158,7 +3166,7 @@
     <w:pPr>
       <w:keepNext/>
       <w:keepLines/>
-      <w:spacing w:before="200" w:after="100" w:line="259" w:lineRule="auto"/>
+      <w:spacing w:before="200" w:after="100" w:line="480" w:lineRule="auto"/>
       <w:outlineLvl w:val="1"/>
     </w:pPr>
     <w:rPr>
@@ -3182,7 +3190,7 @@
     <w:pPr>
       <w:keepNext/>
       <w:keepLines/>
-      <w:spacing w:before="200" w:after="100" w:line="259" w:lineRule="auto"/>
+      <w:spacing w:before="200" w:after="100" w:line="480" w:lineRule="auto"/>
       <w:outlineLvl w:val="2"/>
     </w:pPr>
     <w:rPr>
@@ -3421,7 +3429,7 @@
     <w:qFormat/>
     <w:rsid w:val="00FC693F"/>
     <w:pPr>
-      <w:spacing w:after="240" w:line="259" w:lineRule="auto"/>
+      <w:spacing w:after="240" w:line="480" w:lineRule="auto"/>
       <w:contextualSpacing/>
     </w:pPr>
     <w:rPr>
@@ -3461,7 +3469,7 @@
       <w:numPr>
         <w:ilvl w:val="1"/>
       </w:numPr>
-      <w:spacing w:after="320" w:line="259" w:lineRule="auto"/>
+      <w:spacing w:after="320" w:line="480" w:lineRule="auto"/>
     </w:pPr>
     <w:rPr>
       <w:rFonts w:asciiTheme="majorHAnsi" w:eastAsiaTheme="majorEastAsia" w:hAnsiTheme="majorHAnsi" w:cstheme="majorBidi" w:ascii="Times New Roman" w:hAnsi="Times New Roman"/>
@@ -3866,7 +3874,7 @@
     <w:qFormat/>
     <w:rsid w:val="00FC693F"/>
     <w:pPr>
-      <w:spacing w:line="259" w:lineRule="auto" w:after="100"/>
+      <w:spacing w:line="480" w:lineRule="auto" w:after="100"/>
     </w:pPr>
     <w:rPr>
       <w:rFonts w:ascii="Times New Roman" w:hAnsi="Times New Roman"/>

</xml_diff>